<commit_message>
fix: validate TradingView and broker chart evidence
</commit_message>
<xml_diff>
--- a/reports/TradingView_Community_Analysis_2026-08-27.docx
+++ b/reports/TradingView_Community_Analysis_2026-08-27.docx
@@ -873,6 +873,11 @@
         <w:t>2. Groww Chart, Sahi Chart and Dhan Chart discussions</w:t>
       </w:r>
     </w:p>
+    <w:p>
+      <w:r>
+        <w:t>These are keyword matches across the corpus, not verified unique people. A YouTube title or broker page is product evidence, not community sentiment.</w:t>
+      </w:r>
+    </w:p>
     <w:tbl>
       <w:tblPr>
         <w:tblStyle w:val="TableGrid"/>
@@ -883,14 +888,15 @@
         <w:tblInd w:w="120" w:type="dxa"/>
       </w:tblPr>
       <w:tblGrid>
-        <w:gridCol w:w="3120"/>
-        <w:gridCol w:w="3120"/>
-        <w:gridCol w:w="3120"/>
+        <w:gridCol w:w="2340"/>
+        <w:gridCol w:w="2340"/>
+        <w:gridCol w:w="2340"/>
+        <w:gridCol w:w="2340"/>
       </w:tblGrid>
       <w:tr>
         <w:tc>
           <w:tcPr>
-            <w:tcW w:type="dxa" w:w="2200"/>
+            <w:tcW w:type="dxa" w:w="900"/>
             <w:vAlign w:val="center"/>
             <w:shd w:fill="E8EEF5"/>
           </w:tcPr>
@@ -905,6 +911,21 @@
         </w:tc>
         <w:tc>
           <w:tcPr>
+            <w:tcW w:type="dxa" w:w="3300"/>
+            <w:vAlign w:val="center"/>
+            <w:shd w:fill="E8EEF5"/>
+          </w:tcPr>
+          <w:p>
+            <w:pPr>
+              <w:spacing w:after="40"/>
+            </w:pPr>
+            <w:r>
+              <w:t>Corpus matches</w:t>
+            </w:r>
+          </w:p>
+        </w:tc>
+        <w:tc>
+          <w:tcPr>
             <w:tcW w:type="dxa" w:w="1800"/>
             <w:vAlign w:val="center"/>
             <w:shd w:fill="E8EEF5"/>
@@ -914,13 +935,13 @@
               <w:spacing w:after="40"/>
             </w:pPr>
             <w:r>
-              <w:t>Relevant discussions</w:t>
-            </w:r>
-          </w:p>
-        </w:tc>
-        <w:tc>
-          <w:tcPr>
-            <w:tcW w:type="dxa" w:w="5360"/>
+              <w:t>Source mix</w:t>
+            </w:r>
+          </w:p>
+        </w:tc>
+        <w:tc>
+          <w:tcPr>
+            <w:tcW w:type="dxa" w:w="3360"/>
             <w:vAlign w:val="center"/>
             <w:shd w:fill="E8EEF5"/>
           </w:tcPr>
@@ -929,7 +950,7 @@
               <w:spacing w:after="40"/>
             </w:pPr>
             <w:r>
-              <w:t>What the discussion indicates</w:t>
+              <w:t>What can be concluded</w:t>
             </w:r>
           </w:p>
         </w:tc>
@@ -937,7 +958,7 @@
       <w:tr>
         <w:tc>
           <w:tcPr>
-            <w:tcW w:type="dxa" w:w="2200"/>
+            <w:tcW w:type="dxa" w:w="900"/>
             <w:vAlign w:val="center"/>
           </w:tcPr>
           <w:p>
@@ -951,6 +972,20 @@
         </w:tc>
         <w:tc>
           <w:tcPr>
+            <w:tcW w:type="dxa" w:w="3300"/>
+            <w:vAlign w:val="center"/>
+          </w:tcPr>
+          <w:p>
+            <w:pPr>
+              <w:spacing w:after="40"/>
+            </w:pPr>
+            <w:r>
+              <w:t>4</w:t>
+            </w:r>
+          </w:p>
+        </w:tc>
+        <w:tc>
+          <w:tcPr>
             <w:tcW w:type="dxa" w:w="1800"/>
             <w:vAlign w:val="center"/>
           </w:tcPr>
@@ -959,21 +994,21 @@
               <w:spacing w:after="40"/>
             </w:pPr>
             <w:r>
-              <w:t>2</w:t>
-            </w:r>
-          </w:p>
-        </w:tc>
-        <w:tc>
-          <w:tcPr>
-            <w:tcW w:type="dxa" w:w="5360"/>
-            <w:vAlign w:val="center"/>
-          </w:tcPr>
-          <w:p>
-            <w:pPr>
-              <w:spacing w:after="40"/>
-            </w:pPr>
-            <w:r>
-              <w:t>Users compare chart speed, usability, indicators and reliability.</w:t>
+              <w:t>youtube: 2, manual_web_research: 2</w:t>
+            </w:r>
+          </w:p>
+        </w:tc>
+        <w:tc>
+          <w:tcPr>
+            <w:tcW w:type="dxa" w:w="3360"/>
+            <w:vAlign w:val="center"/>
+          </w:tcPr>
+          <w:p>
+            <w:pPr>
+              <w:spacing w:after="40"/>
+            </w:pPr>
+            <w:r>
+              <w:t>Needs community-specific collection before claiming user preference.</w:t>
             </w:r>
           </w:p>
         </w:tc>
@@ -981,7 +1016,7 @@
       <w:tr>
         <w:tc>
           <w:tcPr>
-            <w:tcW w:type="dxa" w:w="2200"/>
+            <w:tcW w:type="dxa" w:w="900"/>
             <w:vAlign w:val="center"/>
           </w:tcPr>
           <w:p>
@@ -995,6 +1030,20 @@
         </w:tc>
         <w:tc>
           <w:tcPr>
+            <w:tcW w:type="dxa" w:w="3300"/>
+            <w:vAlign w:val="center"/>
+          </w:tcPr>
+          <w:p>
+            <w:pPr>
+              <w:spacing w:after="40"/>
+            </w:pPr>
+            <w:r>
+              <w:t>0</w:t>
+            </w:r>
+          </w:p>
+        </w:tc>
+        <w:tc>
+          <w:tcPr>
             <w:tcW w:type="dxa" w:w="1800"/>
             <w:vAlign w:val="center"/>
           </w:tcPr>
@@ -1003,21 +1052,21 @@
               <w:spacing w:after="40"/>
             </w:pPr>
             <w:r>
-              <w:t>0</w:t>
-            </w:r>
-          </w:p>
-        </w:tc>
-        <w:tc>
-          <w:tcPr>
-            <w:tcW w:type="dxa" w:w="5360"/>
-            <w:vAlign w:val="center"/>
-          </w:tcPr>
-          <w:p>
-            <w:pPr>
-              <w:spacing w:after="40"/>
-            </w:pPr>
-            <w:r>
-              <w:t>No matching discussion found in the current snapshots.</w:t>
+              <w:t>No matching source</w:t>
+            </w:r>
+          </w:p>
+        </w:tc>
+        <w:tc>
+          <w:tcPr>
+            <w:tcW w:type="dxa" w:w="3360"/>
+            <w:vAlign w:val="center"/>
+          </w:tcPr>
+          <w:p>
+            <w:pPr>
+              <w:spacing w:after="40"/>
+            </w:pPr>
+            <w:r>
+              <w:t>No matching record in the current snapshots.</w:t>
             </w:r>
           </w:p>
         </w:tc>
@@ -1025,7 +1074,7 @@
       <w:tr>
         <w:tc>
           <w:tcPr>
-            <w:tcW w:type="dxa" w:w="2200"/>
+            <w:tcW w:type="dxa" w:w="900"/>
             <w:vAlign w:val="center"/>
           </w:tcPr>
           <w:p>
@@ -1039,6 +1088,20 @@
         </w:tc>
         <w:tc>
           <w:tcPr>
+            <w:tcW w:type="dxa" w:w="3300"/>
+            <w:vAlign w:val="center"/>
+          </w:tcPr>
+          <w:p>
+            <w:pPr>
+              <w:spacing w:after="40"/>
+            </w:pPr>
+            <w:r>
+              <w:t>46</w:t>
+            </w:r>
+          </w:p>
+        </w:tc>
+        <w:tc>
+          <w:tcPr>
             <w:tcW w:type="dxa" w:w="1800"/>
             <w:vAlign w:val="center"/>
           </w:tcPr>
@@ -1047,21 +1110,21 @@
               <w:spacing w:after="40"/>
             </w:pPr>
             <w:r>
-              <w:t>45</w:t>
-            </w:r>
-          </w:p>
-        </w:tc>
-        <w:tc>
-          <w:tcPr>
-            <w:tcW w:type="dxa" w:w="5360"/>
-            <w:vAlign w:val="center"/>
-          </w:tcPr>
-          <w:p>
-            <w:pPr>
-              <w:spacing w:after="40"/>
-            </w:pPr>
-            <w:r>
-              <w:t>Users compare chart speed, usability, indicators and reliability.</w:t>
+              <w:t>community_forum: 24, youtube: 21, manual_web_research: 1</w:t>
+            </w:r>
+          </w:p>
+        </w:tc>
+        <w:tc>
+          <w:tcPr>
+            <w:tcW w:type="dxa" w:w="3360"/>
+            <w:vAlign w:val="center"/>
+          </w:tcPr>
+          <w:p>
+            <w:pPr>
+              <w:spacing w:after="40"/>
+            </w:pPr>
+            <w:r>
+              <w:t>Needs community-specific collection before claiming user preference.</w:t>
             </w:r>
           </w:p>
         </w:tc>
@@ -1069,7 +1132,7 @@
       <w:tr>
         <w:tc>
           <w:tcPr>
-            <w:tcW w:type="dxa" w:w="2200"/>
+            <w:tcW w:type="dxa" w:w="900"/>
             <w:vAlign w:val="center"/>
           </w:tcPr>
           <w:p>
@@ -1083,6 +1146,20 @@
         </w:tc>
         <w:tc>
           <w:tcPr>
+            <w:tcW w:type="dxa" w:w="3300"/>
+            <w:vAlign w:val="center"/>
+          </w:tcPr>
+          <w:p>
+            <w:pPr>
+              <w:spacing w:after="40"/>
+            </w:pPr>
+            <w:r>
+              <w:t>0</w:t>
+            </w:r>
+          </w:p>
+        </w:tc>
+        <w:tc>
+          <w:tcPr>
             <w:tcW w:type="dxa" w:w="1800"/>
             <w:vAlign w:val="center"/>
           </w:tcPr>
@@ -1091,21 +1168,21 @@
               <w:spacing w:after="40"/>
             </w:pPr>
             <w:r>
-              <w:t>0</w:t>
-            </w:r>
-          </w:p>
-        </w:tc>
-        <w:tc>
-          <w:tcPr>
-            <w:tcW w:type="dxa" w:w="5360"/>
-            <w:vAlign w:val="center"/>
-          </w:tcPr>
-          <w:p>
-            <w:pPr>
-              <w:spacing w:after="40"/>
-            </w:pPr>
-            <w:r>
-              <w:t>No matching discussion found in the current snapshots.</w:t>
+              <w:t>No matching source</w:t>
+            </w:r>
+          </w:p>
+        </w:tc>
+        <w:tc>
+          <w:tcPr>
+            <w:tcW w:type="dxa" w:w="3360"/>
+            <w:vAlign w:val="center"/>
+          </w:tcPr>
+          <w:p>
+            <w:pPr>
+              <w:spacing w:after="40"/>
+            </w:pPr>
+            <w:r>
+              <w:t>No matching record in the current snapshots.</w:t>
             </w:r>
           </w:p>
         </w:tc>
@@ -8243,7 +8320,7 @@
               <w:spacing w:after="40"/>
             </w:pPr>
             <w:r>
-              <w:t>1268</w:t>
+              <w:t>1272</w:t>
             </w:r>
           </w:p>
         </w:tc>
@@ -8287,7 +8364,7 @@
               <w:spacing w:after="40"/>
             </w:pPr>
             <w:r>
-              <w:t>2</w:t>
+              <w:t>4</w:t>
             </w:r>
           </w:p>
         </w:tc>
@@ -8375,7 +8452,7 @@
               <w:spacing w:after="40"/>
             </w:pPr>
             <w:r>
-              <w:t>45</w:t>
+              <w:t>46</w:t>
             </w:r>
           </w:p>
         </w:tc>
@@ -12126,7 +12203,7 @@
     </w:p>
     <w:p>
       <w:r>
-        <w:t xml:space="preserve">Matching discussions: </w:t>
+        <w:t xml:space="preserve">Matching records: </w:t>
       </w:r>
       <w:r>
         <w:rPr>
@@ -12134,7 +12211,9 @@
         </w:rPr>
         <w:t>0</w:t>
       </w:r>
-      <w:r/>
+      <w:r>
+        <w:t>. Sahi publicly describes a 5-second chart in Scalper Mode, but the current TradingView-community corpus contains no matching user discussion.</w:t>
+      </w:r>
     </w:p>
     <w:p>
       <w:pPr>
@@ -12146,15 +12225,35 @@
     </w:p>
     <w:p>
       <w:r>
-        <w:t xml:space="preserve">Matching discussions: </w:t>
+        <w:t xml:space="preserve">Matching records: </w:t>
       </w:r>
       <w:r>
         <w:rPr>
           <w:b/>
         </w:rPr>
-        <w:t>1452</w:t>
+        <w:t>1453</w:t>
       </w:r>
-      <w:r/>
+      <w:r>
+        <w:t>. This is a broad keyword signal across sources and is not a platform-specific incident count.</w:t>
+      </w:r>
+    </w:p>
+    <w:p>
+      <w:pPr>
+        <w:pStyle w:val="Heading1"/>
+      </w:pPr>
+      <w:r>
+        <w:t>10. Source validation</w:t>
+      </w:r>
+    </w:p>
+    <w:p>
+      <w:r>
+        <w:t>TradingView does have a native options-chain product today, including calls-only, puts-only and straddle views, expiry/strike/spread filters, bid/ask, Greeks and implied volatility. Option-chain mentions in this report describe discussion themes; they do not mean TradingView lacks an option chain.</w:t>
+      </w:r>
+    </w:p>
+    <w:p>
+      <w:r>
+        <w:t>Groww, Dhan and Sahi chart claims are product evidence from official pages. They are separate from community sentiment counts.</w:t>
+      </w:r>
     </w:p>
     <w:p>
       <w:pPr>
@@ -12169,7 +12268,7 @@
         <w:pStyle w:val="ListBullet"/>
       </w:pPr>
       <w:r>
-        <w:t>https://in.tradingview.com/ideas/</w:t>
+        <w:t>https://www.tradingview.com/support/solutions/43000760837-options-chain-overview/</w:t>
       </w:r>
     </w:p>
     <w:p>
@@ -12177,7 +12276,7 @@
         <w:pStyle w:val="ListBullet"/>
       </w:pPr>
       <w:r>
-        <w:t>https://in.tradingview.com/ideas/options/</w:t>
+        <w:t>https://www.tradingview.com/features/</w:t>
       </w:r>
     </w:p>
     <w:p>
@@ -12185,7 +12284,7 @@
         <w:pStyle w:val="ListBullet"/>
       </w:pPr>
       <w:r>
-        <w:t>https://in.tradingview.com/ideas/optionchain/</w:t>
+        <w:t>https://groww.in/groww-charts</w:t>
       </w:r>
     </w:p>
     <w:p>
@@ -12193,7 +12292,7 @@
         <w:pStyle w:val="ListBullet"/>
       </w:pPr>
       <w:r>
-        <w:t>https://in.tradingview.com/ideas/niftyoptions/</w:t>
+        <w:t>https://dhan.co/tradingview/</w:t>
       </w:r>
     </w:p>
     <w:p>
@@ -12201,7 +12300,7 @@
         <w:pStyle w:val="ListBullet"/>
       </w:pPr>
       <w:r>
-        <w:t>https://in.tradingview.com/ideas/banknifty/</w:t>
+        <w:t>https://www.sahi.com/video-guide/en/all-about-the-sahi-scalper-mode-sahiapp</w:t>
       </w:r>
     </w:p>
     <w:p>
@@ -12209,7 +12308,7 @@
         <w:pStyle w:val="ListBullet"/>
       </w:pPr>
       <w:r>
-        <w:t>https://in.tradingview.com/ideas/niftystrategy/</w:t>
+        <w:t>https://www.reddit.com/r/NSEbets/comments/1rwbk91/trading_charts_performance_analysis_fyers_vs_sahi/</w:t>
       </w:r>
     </w:p>
     <w:p>
@@ -12217,7 +12316,7 @@
         <w:pStyle w:val="ListBullet"/>
       </w:pPr>
       <w:r>
-        <w:t>https://in.tradingview.com/ideas/optionbuying/</w:t>
+        <w:t>https://www.reddit.com/r/NSEbets/comments/1tqwpit/groww_glitch/</w:t>
       </w:r>
     </w:p>
     <w:p>
@@ -12225,7 +12324,7 @@
         <w:pStyle w:val="ListBullet"/>
       </w:pPr>
       <w:r>
-        <w:t>https://in.tradingview.com/symbols/NSE-NIFTY/ideas/</w:t>
+        <w:t>https://www.reddit.com/r/IndianStockMarket/comments/1ntib7f/ama_with_the_dhan_team/</w:t>
       </w:r>
     </w:p>
     <w:sectPr>

</xml_diff>